<commit_message>
nuevos cambios, apra que no tenga la frima
</commit_message>
<xml_diff>
--- a/resources/templates/formato_permiso.docx
+++ b/resources/templates/formato_permiso.docx
@@ -21,6 +21,7 @@
       <w:r>
         <w:rPr>
           <w:b/>
+          <w:sz w:val="22"/>
         </w:rPr>
         <w:t>Folio: ${folio}</w:t>
       </w:r>
@@ -44,12 +45,10 @@
             <w:vAlign w:val="center"/>
           </w:tcPr>
           <w:p>
-            <w:r/>
             <w:r>
               <w:rPr>
                 <w:rFonts w:ascii="Arial" w:hAnsi="Arial"/>
-                <w:b/>
-                <w:sz w:val="20"/>
+                <w:sz w:val="18"/>
               </w:rPr>
               <w:t>Tipo de permiso</w:t>
             </w:r>
@@ -61,12 +60,10 @@
             <w:vAlign w:val="center"/>
           </w:tcPr>
           <w:p>
-            <w:r/>
             <w:r>
               <w:rPr>
                 <w:rFonts w:ascii="Arial" w:hAnsi="Arial"/>
-                <w:b w:val="0"/>
-                <w:sz w:val="20"/>
+                <w:sz w:val="18"/>
               </w:rPr>
               <w:t>${tipo_permiso}</w:t>
             </w:r>
@@ -81,12 +78,10 @@
             <w:vAlign w:val="center"/>
           </w:tcPr>
           <w:p>
-            <w:r/>
             <w:r>
               <w:rPr>
                 <w:rFonts w:ascii="Arial" w:hAnsi="Arial"/>
-                <w:b/>
-                <w:sz w:val="20"/>
+                <w:sz w:val="18"/>
               </w:rPr>
               <w:t>Colaborador</w:t>
             </w:r>
@@ -98,12 +93,10 @@
             <w:vAlign w:val="center"/>
           </w:tcPr>
           <w:p>
-            <w:r/>
             <w:r>
               <w:rPr>
                 <w:rFonts w:ascii="Arial" w:hAnsi="Arial"/>
-                <w:b w:val="0"/>
-                <w:sz w:val="20"/>
+                <w:sz w:val="18"/>
               </w:rPr>
               <w:t>${nombre_colaborador}</w:t>
             </w:r>
@@ -118,12 +111,43 @@
             <w:vAlign w:val="center"/>
           </w:tcPr>
           <w:p>
-            <w:r/>
             <w:r>
               <w:rPr>
                 <w:rFonts w:ascii="Arial" w:hAnsi="Arial"/>
-                <w:b/>
-                <w:sz w:val="20"/>
+                <w:sz w:val="18"/>
+              </w:rPr>
+              <w:t>Número de empleado</w:t>
+            </w:r>
+          </w:p>
+        </w:tc>
+        <w:tc>
+          <w:tcPr>
+            <w:tcW w:type="dxa" w:w="5112"/>
+            <w:vAlign w:val="center"/>
+          </w:tcPr>
+          <w:p>
+            <w:r>
+              <w:rPr>
+                <w:rFonts w:ascii="Arial" w:hAnsi="Arial"/>
+                <w:sz w:val="18"/>
+              </w:rPr>
+              <w:t>${numero_empleado}</w:t>
+            </w:r>
+          </w:p>
+        </w:tc>
+      </w:tr>
+      <w:tr>
+        <w:tc>
+          <w:tcPr>
+            <w:tcW w:type="dxa" w:w="5112"/>
+            <w:shd w:fill="E5E7EB"/>
+            <w:vAlign w:val="center"/>
+          </w:tcPr>
+          <w:p>
+            <w:r>
+              <w:rPr>
+                <w:rFonts w:ascii="Arial" w:hAnsi="Arial"/>
+                <w:sz w:val="18"/>
               </w:rPr>
               <w:t>Correo colaborador</w:t>
             </w:r>
@@ -135,12 +159,10 @@
             <w:vAlign w:val="center"/>
           </w:tcPr>
           <w:p>
-            <w:r/>
             <w:r>
               <w:rPr>
                 <w:rFonts w:ascii="Arial" w:hAnsi="Arial"/>
-                <w:b w:val="0"/>
-                <w:sz w:val="20"/>
+                <w:sz w:val="18"/>
               </w:rPr>
               <w:t>${correo_colaborador}</w:t>
             </w:r>
@@ -155,14 +177,12 @@
             <w:vAlign w:val="center"/>
           </w:tcPr>
           <w:p>
-            <w:r/>
             <w:r>
               <w:rPr>
                 <w:rFonts w:ascii="Arial" w:hAnsi="Arial"/>
-                <w:b/>
-                <w:sz w:val="20"/>
+                <w:sz w:val="18"/>
               </w:rPr>
-              <w:t>Área</w:t>
+              <w:t>Área / Departamento</w:t>
             </w:r>
           </w:p>
         </w:tc>
@@ -172,12 +192,10 @@
             <w:vAlign w:val="center"/>
           </w:tcPr>
           <w:p>
-            <w:r/>
             <w:r>
               <w:rPr>
                 <w:rFonts w:ascii="Arial" w:hAnsi="Arial"/>
-                <w:b w:val="0"/>
-                <w:sz w:val="20"/>
+                <w:sz w:val="18"/>
               </w:rPr>
               <w:t>${area}</w:t>
             </w:r>
@@ -192,12 +210,10 @@
             <w:vAlign w:val="center"/>
           </w:tcPr>
           <w:p>
-            <w:r/>
             <w:r>
               <w:rPr>
                 <w:rFonts w:ascii="Arial" w:hAnsi="Arial"/>
-                <w:b/>
-                <w:sz w:val="20"/>
+                <w:sz w:val="18"/>
               </w:rPr>
               <w:t>Puesto</w:t>
             </w:r>
@@ -209,12 +225,10 @@
             <w:vAlign w:val="center"/>
           </w:tcPr>
           <w:p>
-            <w:r/>
             <w:r>
               <w:rPr>
                 <w:rFonts w:ascii="Arial" w:hAnsi="Arial"/>
-                <w:b w:val="0"/>
-                <w:sz w:val="20"/>
+                <w:sz w:val="18"/>
               </w:rPr>
               <w:t>${puesto}</w:t>
             </w:r>
@@ -229,14 +243,12 @@
             <w:vAlign w:val="center"/>
           </w:tcPr>
           <w:p>
-            <w:r/>
             <w:r>
               <w:rPr>
                 <w:rFonts w:ascii="Arial" w:hAnsi="Arial"/>
-                <w:b/>
-                <w:sz w:val="20"/>
+                <w:sz w:val="18"/>
               </w:rPr>
-              <w:t>Líder / jefe directo</w:t>
+              <w:t>Líder directo</w:t>
             </w:r>
           </w:p>
         </w:tc>
@@ -246,12 +258,10 @@
             <w:vAlign w:val="center"/>
           </w:tcPr>
           <w:p>
-            <w:r/>
             <w:r>
               <w:rPr>
                 <w:rFonts w:ascii="Arial" w:hAnsi="Arial"/>
-                <w:b w:val="0"/>
-                <w:sz w:val="20"/>
+                <w:sz w:val="18"/>
               </w:rPr>
               <w:t>${lider}</w:t>
             </w:r>
@@ -266,12 +276,10 @@
             <w:vAlign w:val="center"/>
           </w:tcPr>
           <w:p>
-            <w:r/>
             <w:r>
               <w:rPr>
                 <w:rFonts w:ascii="Arial" w:hAnsi="Arial"/>
-                <w:b/>
-                <w:sz w:val="20"/>
+                <w:sz w:val="18"/>
               </w:rPr>
               <w:t>Correo líder</w:t>
             </w:r>
@@ -283,12 +291,10 @@
             <w:vAlign w:val="center"/>
           </w:tcPr>
           <w:p>
-            <w:r/>
             <w:r>
               <w:rPr>
                 <w:rFonts w:ascii="Arial" w:hAnsi="Arial"/>
-                <w:b w:val="0"/>
-                <w:sz w:val="20"/>
+                <w:sz w:val="18"/>
               </w:rPr>
               <w:t>${correo_lider}</w:t>
             </w:r>
@@ -303,12 +309,10 @@
             <w:vAlign w:val="center"/>
           </w:tcPr>
           <w:p>
-            <w:r/>
             <w:r>
               <w:rPr>
                 <w:rFonts w:ascii="Arial" w:hAnsi="Arial"/>
-                <w:b/>
-                <w:sz w:val="20"/>
+                <w:sz w:val="18"/>
               </w:rPr>
               <w:t>Fecha inicio</w:t>
             </w:r>
@@ -320,12 +324,10 @@
             <w:vAlign w:val="center"/>
           </w:tcPr>
           <w:p>
-            <w:r/>
             <w:r>
               <w:rPr>
                 <w:rFonts w:ascii="Arial" w:hAnsi="Arial"/>
-                <w:b w:val="0"/>
-                <w:sz w:val="20"/>
+                <w:sz w:val="18"/>
               </w:rPr>
               <w:t>${fecha_inicio}</w:t>
             </w:r>
@@ -340,12 +342,10 @@
             <w:vAlign w:val="center"/>
           </w:tcPr>
           <w:p>
-            <w:r/>
             <w:r>
               <w:rPr>
                 <w:rFonts w:ascii="Arial" w:hAnsi="Arial"/>
-                <w:b/>
-                <w:sz w:val="20"/>
+                <w:sz w:val="18"/>
               </w:rPr>
               <w:t>Fecha fin</w:t>
             </w:r>
@@ -357,12 +357,10 @@
             <w:vAlign w:val="center"/>
           </w:tcPr>
           <w:p>
-            <w:r/>
             <w:r>
               <w:rPr>
                 <w:rFonts w:ascii="Arial" w:hAnsi="Arial"/>
-                <w:b w:val="0"/>
-                <w:sz w:val="20"/>
+                <w:sz w:val="18"/>
               </w:rPr>
               <w:t>${fecha_fin}</w:t>
             </w:r>
@@ -377,12 +375,10 @@
             <w:vAlign w:val="center"/>
           </w:tcPr>
           <w:p>
-            <w:r/>
             <w:r>
               <w:rPr>
                 <w:rFonts w:ascii="Arial" w:hAnsi="Arial"/>
-                <w:b/>
-                <w:sz w:val="20"/>
+                <w:sz w:val="18"/>
               </w:rPr>
               <w:t>Días solicitados</w:t>
             </w:r>
@@ -394,12 +390,10 @@
             <w:vAlign w:val="center"/>
           </w:tcPr>
           <w:p>
-            <w:r/>
             <w:r>
               <w:rPr>
                 <w:rFonts w:ascii="Arial" w:hAnsi="Arial"/>
-                <w:b w:val="0"/>
-                <w:sz w:val="20"/>
+                <w:sz w:val="18"/>
               </w:rPr>
               <w:t>${dias_solicitados}</w:t>
             </w:r>
@@ -414,14 +408,12 @@
             <w:vAlign w:val="center"/>
           </w:tcPr>
           <w:p>
-            <w:r/>
             <w:r>
               <w:rPr>
                 <w:rFonts w:ascii="Arial" w:hAnsi="Arial"/>
-                <w:b/>
-                <w:sz w:val="20"/>
+                <w:sz w:val="18"/>
               </w:rPr>
-              <w:t>Fecha solicitud</w:t>
+              <w:t>Fecha de solicitud</w:t>
             </w:r>
           </w:p>
         </w:tc>
@@ -431,12 +423,10 @@
             <w:vAlign w:val="center"/>
           </w:tcPr>
           <w:p>
-            <w:r/>
             <w:r>
               <w:rPr>
                 <w:rFonts w:ascii="Arial" w:hAnsi="Arial"/>
-                <w:b w:val="0"/>
-                <w:sz w:val="20"/>
+                <w:sz w:val="18"/>
               </w:rPr>
               <w:t>${fecha_solicitud}</w:t>
             </w:r>
@@ -451,12 +441,10 @@
             <w:vAlign w:val="center"/>
           </w:tcPr>
           <w:p>
-            <w:r/>
             <w:r>
               <w:rPr>
                 <w:rFonts w:ascii="Arial" w:hAnsi="Arial"/>
-                <w:b/>
-                <w:sz w:val="20"/>
+                <w:sz w:val="18"/>
               </w:rPr>
               <w:t>Estatus</w:t>
             </w:r>
@@ -468,12 +456,10 @@
             <w:vAlign w:val="center"/>
           </w:tcPr>
           <w:p>
-            <w:r/>
             <w:r>
               <w:rPr>
                 <w:rFonts w:ascii="Arial" w:hAnsi="Arial"/>
-                <w:b w:val="0"/>
-                <w:sz w:val="20"/>
+                <w:sz w:val="18"/>
               </w:rPr>
               <w:t>${estatus}</w:t>
             </w:r>
@@ -490,6 +476,9 @@
       </w:r>
     </w:p>
     <w:p>
+      <w:pPr>
+        <w:spacing w:after="160"/>
+      </w:pPr>
       <w:r>
         <w:t>${motivo}</w:t>
       </w:r>
@@ -499,27 +488,15 @@
         <w:rPr>
           <w:b/>
         </w:rPr>
-        <w:t>Recepción RH</w:t>
+        <w:t>Indicaciones</w:t>
       </w:r>
     </w:p>
     <w:p>
+      <w:pPr>
+        <w:jc w:val="both"/>
+      </w:pPr>
       <w:r>
-        <w:t>Formato recibido: ${formato_recibido}</w:t>
-      </w:r>
-    </w:p>
-    <w:p>
-      <w:r>
-        <w:t>Observaciones RH: ${observaciones_rh}</w:t>
-      </w:r>
-    </w:p>
-    <w:p/>
-    <w:p>
-      <w:r>
-        <w:rPr>
-          <w:b/>
-          <w:sz w:val="24"/>
-        </w:rPr>
-        <w:t>Firmas</w:t>
+        <w:t>El presente formato debe ser revisado y firmado físicamente por el líder directo y por el colaborador. Una vez firmado, deberá entregarse a Recursos Humanos para marcarlo como recibido en el sistema.</w:t>
       </w:r>
     </w:p>
     <w:tbl>
@@ -540,14 +517,21 @@
             <w:vAlign w:val="center"/>
           </w:tcPr>
           <w:p>
-            <w:r/>
+            <w:pPr>
+              <w:jc w:val="center"/>
+            </w:pPr>
             <w:r>
               <w:rPr>
                 <w:rFonts w:ascii="Arial" w:hAnsi="Arial"/>
-                <w:b/>
-                <w:sz w:val="20"/>
+                <w:sz w:val="18"/>
               </w:rPr>
-              <w:t>Firma colaborador</w:t>
+              <w:br/>
+              <w:br/>
+              <w:t>__________________________________</w:t>
+              <w:br/>
+              <w:t>Firma del líder directo</w:t>
+              <w:br/>
+              <w:t>${lider}</w:t>
             </w:r>
           </w:p>
         </w:tc>
@@ -557,14 +541,21 @@
             <w:vAlign w:val="center"/>
           </w:tcPr>
           <w:p>
-            <w:r/>
+            <w:pPr>
+              <w:jc w:val="center"/>
+            </w:pPr>
             <w:r>
               <w:rPr>
                 <w:rFonts w:ascii="Arial" w:hAnsi="Arial"/>
-                <w:b/>
-                <w:sz w:val="20"/>
+                <w:sz w:val="18"/>
               </w:rPr>
-              <w:t>Firma líder / jefe directo</w:t>
+              <w:br/>
+              <w:br/>
+              <w:t>__________________________________</w:t>
+              <w:br/>
+              <w:t>Firma del colaborador</w:t>
+              <w:br/>
+              <w:t>${nombre_colaborador}</w:t>
             </w:r>
           </w:p>
         </w:tc>
@@ -576,14 +567,16 @@
             <w:vAlign w:val="center"/>
           </w:tcPr>
           <w:p>
-            <w:r/>
+            <w:pPr>
+              <w:jc w:val="center"/>
+            </w:pPr>
             <w:r>
               <w:rPr>
                 <w:rFonts w:ascii="Arial" w:hAnsi="Arial"/>
-                <w:b w:val="0"/>
-                <w:sz w:val="20"/>
+                <w:sz w:val="18"/>
               </w:rPr>
-              <w:t>${firma_colaborador}</w:t>
+              <w:br/>
+              <w:t>Fecha firma líder: ____ / ____ / ______</w:t>
             </w:r>
           </w:p>
         </w:tc>
@@ -593,32 +586,140 @@
             <w:vAlign w:val="center"/>
           </w:tcPr>
           <w:p>
-            <w:r/>
+            <w:pPr>
+              <w:jc w:val="center"/>
+            </w:pPr>
             <w:r>
               <w:rPr>
                 <w:rFonts w:ascii="Arial" w:hAnsi="Arial"/>
-                <w:b w:val="0"/>
-                <w:sz w:val="20"/>
+                <w:sz w:val="18"/>
               </w:rPr>
-              <w:t>${firma_lider}</w:t>
+              <w:br/>
+              <w:t>Fecha firma colaborador: ____ / ____ / ______</w:t>
             </w:r>
           </w:p>
         </w:tc>
       </w:tr>
     </w:tbl>
-    <w:p/>
     <w:p>
-      <w:pPr>
-        <w:jc w:val="center"/>
-      </w:pPr>
       <w:r>
         <w:rPr>
-          <w:i/>
-          <w:sz w:val="16"/>
+          <w:b/>
         </w:rPr>
-        <w:t>Este documento fue generado por el Sistema RH. La evidencia de firma digital interna incluye fecha, hora, correo, IP y token único de firma.</w:t>
+        <w:t>Recepción RH</w:t>
       </w:r>
     </w:p>
+    <w:tbl>
+      <w:tblPr>
+        <w:tblStyle w:val="TableGrid"/>
+        <w:tblW w:type="auto" w:w="0"/>
+        <w:jc w:val="center"/>
+        <w:tblLook w:firstColumn="1" w:firstRow="1" w:lastColumn="0" w:lastRow="0" w:noHBand="0" w:noVBand="1" w:val="04A0"/>
+      </w:tblPr>
+      <w:tblGrid>
+        <w:gridCol w:w="5112"/>
+        <w:gridCol w:w="5112"/>
+      </w:tblGrid>
+      <w:tr>
+        <w:tc>
+          <w:tcPr>
+            <w:tcW w:type="dxa" w:w="5112"/>
+            <w:shd w:fill="E5E7EB"/>
+            <w:vAlign w:val="center"/>
+          </w:tcPr>
+          <w:p>
+            <w:r>
+              <w:rPr>
+                <w:rFonts w:ascii="Arial" w:hAnsi="Arial"/>
+                <w:sz w:val="18"/>
+              </w:rPr>
+              <w:t>Recibido por RH</w:t>
+            </w:r>
+          </w:p>
+        </w:tc>
+        <w:tc>
+          <w:tcPr>
+            <w:tcW w:type="dxa" w:w="5112"/>
+            <w:vAlign w:val="center"/>
+          </w:tcPr>
+          <w:p>
+            <w:r>
+              <w:rPr>
+                <w:rFonts w:ascii="Arial" w:hAnsi="Arial"/>
+                <w:sz w:val="18"/>
+              </w:rPr>
+              <w:t>__________________________________</w:t>
+            </w:r>
+          </w:p>
+        </w:tc>
+      </w:tr>
+      <w:tr>
+        <w:tc>
+          <w:tcPr>
+            <w:tcW w:type="dxa" w:w="5112"/>
+            <w:shd w:fill="E5E7EB"/>
+            <w:vAlign w:val="center"/>
+          </w:tcPr>
+          <w:p>
+            <w:r>
+              <w:rPr>
+                <w:rFonts w:ascii="Arial" w:hAnsi="Arial"/>
+                <w:sz w:val="18"/>
+              </w:rPr>
+              <w:t>Fecha de recepción</w:t>
+            </w:r>
+          </w:p>
+        </w:tc>
+        <w:tc>
+          <w:tcPr>
+            <w:tcW w:type="dxa" w:w="5112"/>
+            <w:vAlign w:val="center"/>
+          </w:tcPr>
+          <w:p>
+            <w:r>
+              <w:rPr>
+                <w:rFonts w:ascii="Arial" w:hAnsi="Arial"/>
+                <w:sz w:val="18"/>
+              </w:rPr>
+              <w:t>____ / ____ / ______</w:t>
+            </w:r>
+          </w:p>
+        </w:tc>
+      </w:tr>
+      <w:tr>
+        <w:tc>
+          <w:tcPr>
+            <w:tcW w:type="dxa" w:w="5112"/>
+            <w:shd w:fill="E5E7EB"/>
+            <w:vAlign w:val="center"/>
+          </w:tcPr>
+          <w:p>
+            <w:r>
+              <w:rPr>
+                <w:rFonts w:ascii="Arial" w:hAnsi="Arial"/>
+                <w:sz w:val="18"/>
+              </w:rPr>
+              <w:t>Observaciones</w:t>
+            </w:r>
+          </w:p>
+        </w:tc>
+        <w:tc>
+          <w:tcPr>
+            <w:tcW w:type="dxa" w:w="5112"/>
+            <w:vAlign w:val="center"/>
+          </w:tcPr>
+          <w:p>
+            <w:r>
+              <w:rPr>
+                <w:rFonts w:ascii="Arial" w:hAnsi="Arial"/>
+                <w:sz w:val="18"/>
+              </w:rPr>
+              <w:t>____________________________________________________________</w:t>
+            </w:r>
+          </w:p>
+        </w:tc>
+      </w:tr>
+    </w:tbl>
     <w:sectPr>
       <w:pgSz w:w="12240" w:h="15840"/>
       <w:pgMar w:top="864" w:right="1008" w:bottom="864" w:left="1008" w:header="720" w:footer="720" w:gutter="0"/>

</xml_diff>